<commit_message>
docs: add standalone Drone/EOSDA and Ecosystem Health reports
Add two new standalone report authoring builds:
- STANDALONE_Drone_Survey_EOSDA_Report.docx: final formatted Word document
- STANDALONE_Ecosystem_Health_Report.docx / _v2.docx: final formatted Word documents
- drafts/drone_eosda_build/: 8 chapter .md files for drone survey & EOSDA report
- drafts/ecosystem_health_build/: 13 chapter .md files for ecosystem health report
- STANDALONE_REPORT_STRUCTURES.md: structural planning reference for all standalone reports

Also updates STANDALONE_MRV_Report_Final.docx and drafts/STANDALONE_National_MRV_Report.docx,
and removes the superseded standalone_drone_monitoring_report.md draft.

Co-Authored-By: Claude Sonnet 4.6 <noreply@anthropic.com>
</commit_message>
<xml_diff>
--- a/STANDALONE_MRV_Report_Final.docx
+++ b/STANDALONE_MRV_Report_Final.docx
@@ -6351,11 +6351,35 @@
         <w:pStyle w:val="FirstParagraph"/>
       </w:pPr>
       <w:r>
-        <w:t xml:space="preserve">Ghana’s 2025 national blue carbon baseline has produced the most accurate account of the country’s coastal mangrove resource ever assembled, and its central finding is both an opportunity and an obligation. The assessment, conducted by Ecological Nest Ltd under the West Africa Coastal Areas Resilience Investment Project (WACA ResIP 2, World Bank Project P175625, approved December 2022), mapped a national coastal mangrove extent of 30,025 hectares using harmonised Sentinel-2 satellite imagery at 10–20 metre resolution, classified through a Random Forest algorithm on Google Earth Engine (GEE) and validated against 319 participatory ground-truth reference points. This figure — 2.81% of the total 1,068,361.48-hectare coastal landscape across 35 </w:t>
+        <w:t xml:space="preserve">Ghana’s 2025 national blue carbon baseline has produced </w:t>
+      </w:r>
+      <w:r>
+        <w:t xml:space="preserve">one of </w:t>
+      </w:r>
+      <w:r>
+        <w:t xml:space="preserve">the most accurate </w:t>
+      </w:r>
+      <w:r>
+        <w:t>accounts</w:t>
+      </w:r>
+      <w:r>
+        <w:t xml:space="preserve"> of the country’s coastal mangrove resource ever assembled, and its central finding is both an opportunity and an obligation. The assessment, conducted by Ecological Nest Ltd under the West Africa Coastal Areas Resilience Investment Project (WACA ResIP 2, World Bank Project P175625, approved December 2022), mapped a national coastal mangrove extent of 30,025 hectares using harmonised Sentinel-2 satellite imagery at 10–20 metre resolution, classified through a Random Forest algorithm on Google Earth Engine (GEE) and validated against 319 participatory ground-truth reference points. This figure — 2.81% of the total 1,068,361.48-hectare </w:t>
       </w:r>
       <w:r>
         <w:lastRenderedPageBreak/>
-        <w:t>districts and 550 kilometres of coastline — is substantially larger than any previous national estimate, which ranged from 7,240 hectares in 2013 to 18,100 hectares in 1980. The discrepancy is methodological, not ecological: the fringing stands and small fragmented patches that earlier Landsat-based analyses missed at 30-metre resolution are real forests, holding real carbon, and generating real climate obligations. Ghana now has a number it can defend.</w:t>
+        <w:t xml:space="preserve">coastal landscape across 35 districts and 550 kilometres of coastline — is substantially larger than any previous national estimate, which ranged from 7,240 hectares in 2013 to 18,100 hectares in 1980. The discrepancy is methodological, not ecological: the fringing stands and small fragmented patches that earlier Landsat-based analyses missed at 30-metre resolution are real forests, holding real carbon, and generating real climate obligations. </w:t>
+      </w:r>
+      <w:r>
+        <w:t xml:space="preserve">The communities played a key role in </w:t>
+      </w:r>
+      <w:r>
+        <w:t>identifying and pointing the GIS Teams to locations the current global li</w:t>
+      </w:r>
+      <w:r>
+        <w:t xml:space="preserve">terature does not support. Through this study, </w:t>
+      </w:r>
+      <w:r>
+        <w:t>Ghana now has a number it can defend.</w:t>
       </w:r>
     </w:p>
     <w:p>
@@ -6380,15 +6404,18 @@
         <w:t>Rhizophora racemosa</w:t>
       </w:r>
       <w:r>
-        <w:t xml:space="preserve"> fuelwood, preferred by kilns across the lagoon fringe for its heat output and the distinctive flavour it imparts to smoked fish. This creates what the baseline characterises as a social-ecological trap: the livelihoods that the ecosystem makes possible depend on consuming the ecosystem that supports them, progressively degrading the nursery habitat that sustains fish stocks and the mangrove canopy that supplies the fuel to process them. Approximately 70% of the natural mangrove cover around the Keta Lagoon has already been degraded or fragmented, with the most severe losses near settlements like Bomigo, Galo, and Sota. Superimposed on this livelihood-driven pressure is a structural geophysical risk that no community governance mechanism can reverse: the Akosombo Dam, constructed in 1964 sixty kilometres upstream on the Volta River, traps more than 90% of the river’s natural sediment load, starving the narrow coastal sandspit that separates the Keta Lagoon from the Atlantic Ocean of the material it needs to hold its position. The delta has shifted from a prograding system to an eroding one, exposing the mangrove estate to increasing wave energy and saltwater stress as the barrier thins. The measured consequence is a historical deforestation rate of 2.15% per year at Keta — a trajectory that, if uninterrupted, represents the loss of approximately 445 hectares of mangrove annually from Ghana’s most important carbon store.</w:t>
-      </w:r>
-    </w:p>
-    <w:p>
-      <w:pPr>
-        <w:pStyle w:val="BodyText"/>
-      </w:pPr>
+        <w:t xml:space="preserve"> fuelwood, preferred by kilns across the lagoon fringe for its heat output and the distinctive flavour it imparts to smoked fish. This creates what the baseline characterises as a social-ecological trap: the livelihoods that the ecosystem makes possible depend on consuming the ecosystem that supports them, progressively degrading the nursery habitat that sustains fish stocks and the mangrove canopy that supplies the fuel to process them. Approximately 70% of the natural mangrove cover around the Keta Lagoon has already been degraded or fragmented, with the most severe losses near settlements like Bomigo, Galo, and Sota. Superimposed on this livelihood-driven pressure is a structural geophysical risk that no community governance mechanism can reverse: the Akosombo Dam, constructed in 1964 sixty kilometres upstream on the Volta River, traps more than 90% of the river’s natural sediment load, starving the narrow coastal sandspit that separates the Keta Lagoon from the Atlantic Ocean of the material it needs to hold its position. The delta has shifted from a prograding system to an eroding one, exposing the mangrove estate to increasing wave energy and saltwater stress as the barrier thins. The measured consequence is a historical deforestation rate of 2.15% per year at Keta — a trajectory that, if </w:t>
+      </w:r>
       <w:r>
         <w:lastRenderedPageBreak/>
+        <w:t>uninterrupted, represents the loss of approximately 445 hectares of mangrove annually from Ghana’s most important carbon store.</w:t>
+      </w:r>
+    </w:p>
+    <w:p>
+      <w:pPr>
+        <w:pStyle w:val="BodyText"/>
+      </w:pPr>
+      <w:r>
         <w:t>At Songor, the degradation profile is categorically different and, in important respects, further advanced. The 465.76 hectares of mangrove that survive at Songor are the remnant of a landscape largely converted to salt pan infrastructure by industrial and artisanal mining operations concentrated around Elavanyo and Obane. Communities at Totope and Azizanya have experienced direct coastal erosion as mangrove buffering has been removed; field teams documented residential displacement at Totope attributed to shoreline retreat that mangrove loss has accelerated. The land tenure disputes between private salt companies, the Ada Traditional Council, and traditional fishing communities create a governance environment so fractured that CREMA — Community Resource Management Area — formation at the focal community of Pute requires conflict mediation as a prerequisite, not a parallel process. At Muni-Pomadze, where charcoal production and agricultural encroachment at communities including Bewadze have reduced mangrove to ecological insignificance, the contribution to Ghana’s carbon programme will come entirely from future restoration at the early action hub of Sankor, a community whose exceptionally high social cohesion and strong women’s groups represent the most promising governance starting conditions of the three sites.</w:t>
       </w:r>
     </w:p>
@@ -6405,11 +6432,8 @@
         <w:pStyle w:val="BodyText"/>
       </w:pPr>
       <w:r>
-        <w:t xml:space="preserve">The 2025 baseline assessment phase has established Ghana’s Year 0 MRV foundation with a depth that places the country at the frontier of national blue carbon programme development on the African continent. The geospatial baseline is complete, covering </w:t>
-      </w:r>
-      <w:r>
         <w:lastRenderedPageBreak/>
-        <w:t xml:space="preserve">30,025 hectares with the methodological rigour that the Verified Carbon Standard (Verra/VCS), Gold Standard, and Plan Vivo standards require as a precondition for project registration. Carbon inventories have been conducted and the Salo Permanent Sample Plot 1 in the Keta Lagoon Complex has been established, providing the biomass and soil organic carbon anchor against which all future stock changes will be measured on a three-to-five year re-measurement cycle. The 57-station wetland monitoring network at Keta and the 23-station network at Ada are operational, providing quarterly water quality and soil chemistry data across a parameter suite — pH, salinity, dissolved oxygen, conductivity, humus content, and six additional indicators — that gives Ghana’s principal blue carbon site a real-time ecological surveillance capacity unique in the national programme. The digital platform, developed by GAB Climate Smart Investment Ltd on a Next.js/Supabase architecture at </w:t>
+        <w:t xml:space="preserve">The 2025 baseline assessment phase has established Ghana’s Year 0 MRV foundation with a depth that places the country at the frontier of national blue carbon programme development on the African continent. The geospatial baseline is complete, covering 30,025 hectares with the methodological rigour that the Verified Carbon Standard (Verra/VCS), Gold Standard, and Plan Vivo standards require as a precondition for project registration. Carbon inventories have been conducted and the Salo Permanent Sample Plot 1 in the Keta Lagoon Complex has been established, providing the biomass and soil organic carbon anchor against which all future stock changes will be measured on a three-to-five year re-measurement cycle. The 57-station wetland monitoring network at Keta and the 23-station network at Ada are operational, providing quarterly water quality and soil chemistry data across a parameter suite — pH, salinity, dissolved oxygen, conductivity, humus content, and six additional indicators — that gives Ghana’s principal blue carbon site a real-time ecological surveillance capacity unique in the national programme. The digital platform, developed by GAB Climate Smart Investment Ltd on a Next.js/Supabase architecture at </w:t>
       </w:r>
       <w:r>
         <w:rPr>
@@ -6444,6 +6468,7 @@
         <w:rPr>
           <w:i/>
         </w:rPr>
+        <w:lastRenderedPageBreak/>
         <w:t>Executive Summary — MRV Standalone Report: Assessment of Blue Carbon Ecosystem Potentials of Ghana. Delivered to MESTI and MLNR under World Bank WACA ResIP 2 (P175625). Authored by Ecological Nest Ltd, March 2026.</w:t>
       </w:r>
     </w:p>
@@ -6461,7 +6486,6 @@
       <w:bookmarkStart w:id="2" w:name="chapter-1-introduction"/>
       <w:bookmarkStart w:id="3" w:name="_Toc225323370"/>
       <w:r>
-        <w:lastRenderedPageBreak/>
         <w:t>Chapter 1: Introduction</w:t>
       </w:r>
       <w:bookmarkEnd w:id="2"/>
@@ -6507,7 +6531,11 @@
         <w:pStyle w:val="BodyText"/>
       </w:pPr>
       <w:r>
-        <w:t>The technical assessment work at the heart of this report was awarded to Ecological Nest Ltd under the Consulting Service for the Assessment of Blue Carbon Ecosystem Potentials of Ghana (Mangrove and Tidal Salt Marsh). The consultancy was charged with a specific and consequential objective: to assess and prioritise Ghana’s blue carbon ecosystem potential and to produce the baseline data necessary to develop blue carbon projects that meet both compliance and voluntary carbon market standards. That objective is not simply a technical exercise. It places Ghana at the frontier of a global movement in which coastal ecosystem management generates measurable, verifiable carbon outcomes that can attract climate finance, discharge treaty obligations, and sustain the communities that depend on mangroves and salt marshes for their livelihoods. This report is the primary technical instrument through which those outcomes will be tracked, reported, and verified.</w:t>
+        <w:t xml:space="preserve">The technical assessment work at the heart of this report was awarded to Ecological Nest Ltd under the Consulting Service for the Assessment of Blue Carbon Ecosystem Potentials of Ghana (Mangrove and Tidal Salt Marsh). The consultancy was charged with a specific and consequential objective: to assess and prioritise Ghana’s blue carbon ecosystem potential and to produce the baseline data necessary to develop blue carbon projects that meet both compliance and voluntary carbon market standards. That objective is not simply a technical exercise. It places Ghana at the frontier of a global movement in which coastal ecosystem management generates measurable, verifiable carbon outcomes that can attract climate finance, discharge treaty obligations, and sustain the communities that depend on mangroves and salt marshes for their </w:t>
+      </w:r>
+      <w:r>
+        <w:lastRenderedPageBreak/>
+        <w:t>livelihoods. This report is the primary technical instrument through which those outcomes will be tracked, reported, and verified.</w:t>
       </w:r>
     </w:p>
     <w:p>
@@ -6524,7 +6552,6 @@
       <w:bookmarkStart w:id="6" w:name="ghanas-policy-context"/>
       <w:bookmarkStart w:id="7" w:name="_Toc225323372"/>
       <w:r>
-        <w:lastRenderedPageBreak/>
         <w:t>1.2 Ghana’s Policy Context</w:t>
       </w:r>
       <w:bookmarkEnd w:id="6"/>
@@ -6564,6 +6591,7 @@
     </w:p>
     <w:p>
       <w:r>
+        <w:lastRenderedPageBreak/>
         <w:pict w14:anchorId="1055082F">
           <v:rect id="_x0000_i1030" style="width:0;height:1.5pt" o:hralign="center" o:hrstd="t" o:hr="t"/>
         </w:pict>
@@ -6576,7 +6604,6 @@
       <w:bookmarkStart w:id="8" w:name="the-seven-phase-work-programme"/>
       <w:bookmarkStart w:id="9" w:name="_Toc225323373"/>
       <w:r>
-        <w:lastRenderedPageBreak/>
         <w:t>1.3 The Seven-Phase Work Programme</w:t>
       </w:r>
       <w:bookmarkEnd w:id="8"/>
@@ -6635,11 +6662,8 @@
         <w:pStyle w:val="BodyText"/>
       </w:pPr>
       <w:r>
-        <w:t xml:space="preserve">Phase 6, the Strategy for Mangrove and Salt Marsh Restoration, identified priority areas for ecological recovery, assessed restoration feasibility and methods, and recommended the institutional arrangements necessary to govern restoration </w:t>
-      </w:r>
-      <w:r>
         <w:lastRenderedPageBreak/>
-        <w:t>programmes at scale. Grounded in the drivers of degradation documented in earlier phases, the strategy connects ecological diagnosis to practical recovery action.</w:t>
+        <w:t>Phase 6, the Strategy for Mangrove and Salt Marsh Restoration, identified priority areas for ecological recovery, assessed restoration feasibility and methods, and recommended the institutional arrangements necessary to govern restoration programmes at scale. Grounded in the drivers of degradation documented in earlier phases, the strategy connects ecological diagnosis to practical recovery action.</w:t>
       </w:r>
     </w:p>
     <w:p>
@@ -6706,11 +6730,8 @@
         <w:pStyle w:val="BodyText"/>
       </w:pPr>
       <w:r>
-        <w:t xml:space="preserve">These three purposes create a document that is simultaneously operational guidance, synthesis input, and technical evidence. The MRV Standalone Report is not a planning </w:t>
-      </w:r>
-      <w:r>
         <w:lastRenderedPageBreak/>
-        <w:t>framework or a concept note. It describes a system that has been designed, partially deployed, and grounded in the specific ecological and institutional realities of Ghana’s coastal landscape.</w:t>
+        <w:t>These three purposes create a document that is simultaneously operational guidance, synthesis input, and technical evidence. The MRV Standalone Report is not a planning framework or a concept note. It describes a system that has been designed, partially deployed, and grounded in the specific ecological and institutional realities of Ghana’s coastal landscape.</w:t>
       </w:r>
     </w:p>
     <w:p>
@@ -6769,11 +6790,11 @@
         <w:pStyle w:val="BodyText"/>
       </w:pPr>
       <w:r>
-        <w:t xml:space="preserve">The geographic scope of this MRV report operates at two levels simultaneously. At the national framework level, it provides the monitoring architecture, institutional arrangements, reporting cycle, and carbon accounting protocol that apply to all blue carbon ecosystems along Ghana’s coastline. At the pilot implementation level, it </w:t>
+        <w:t xml:space="preserve">The geographic scope of this MRV report operates at two levels simultaneously. At the national framework level, it provides the monitoring architecture, institutional </w:t>
       </w:r>
       <w:r>
         <w:lastRenderedPageBreak/>
-        <w:t>describes in operational detail the specific monitoring infrastructure, station network, and field protocols deployed at Keta — the site where the deepest layered baseline, the most complete PSP network, and the most advanced governance structures make full MRV system deployment possible within the current project cycle.</w:t>
+        <w:t>arrangements, reporting cycle, and carbon accounting protocol that apply to all blue carbon ecosystems along Ghana’s coastline. At the pilot implementation level, it describes in operational detail the specific monitoring infrastructure, station network, and field protocols deployed at Keta — the site where the deepest layered baseline, the most complete PSP network, and the most advanced governance structures make full MRV system deployment possible within the current project cycle.</w:t>
       </w:r>
     </w:p>
     <w:p>
@@ -6840,11 +6861,8 @@
         <w:pStyle w:val="BodyText"/>
       </w:pPr>
       <w:r>
-        <w:t xml:space="preserve">The Governance Readiness Evaluation assessed the institutional capacity of existing community governance structures — CREMAs, traditional authority systems, and </w:t>
-      </w:r>
-      <w:r>
         <w:lastRenderedPageBreak/>
-        <w:t>district management institutions — to participate meaningfully in monitoring, benefit-sharing, and grievance management. Its findings determine the calibration of Layer III, the Governance and Safeguard Assurance Layer, which tracks the health of governance institutions over time and flags risks of elite capture, exclusion, and benefit-sharing failure before they undermine the integrity of the carbon programme.</w:t>
+        <w:t>The Governance Readiness Evaluation assessed the institutional capacity of existing community governance structures — CREMAs, traditional authority systems, and district management institutions — to participate meaningfully in monitoring, benefit-sharing, and grievance management. Its findings determine the calibration of Layer III, the Governance and Safeguard Assurance Layer, which tracks the health of governance institutions over time and flags risks of elite capture, exclusion, and benefit-sharing failure before they undermine the integrity of the carbon programme.</w:t>
       </w:r>
     </w:p>
     <w:p>
@@ -6911,11 +6929,11 @@
         <w:pStyle w:val="BodyText"/>
       </w:pPr>
       <w:r>
-        <w:t xml:space="preserve">Chapter 4, Ecological and Carbon Integrity Layer, provides the detailed specification of Layer I — the monitoring of carbon stocks, ecosystem extent, and restoration performance that forms the scientific core of the MRV system. It describes the PSP network, carbon pool measurement protocols, remote sensing cadence, and the </w:t>
+        <w:t xml:space="preserve">Chapter 4, Ecological and Carbon Integrity Layer, provides the detailed specification of Layer I — the monitoring of carbon stocks, ecosystem extent, and restoration </w:t>
       </w:r>
       <w:r>
         <w:lastRenderedPageBreak/>
-        <w:t>methodological alignment with the IPCC Wetlands Supplement that qualifies the system for both national reporting and carbon market verification.</w:t>
+        <w:t>performance that forms the scientific core of the MRV system. It describes the PSP network, carbon pool measurement protocols, remote sensing cadence, and the methodological alignment with the IPCC Wetlands Supplement that qualifies the system for both national reporting and carbon market verification.</w:t>
       </w:r>
     </w:p>
     <w:p>
@@ -6971,15 +6989,18 @@
         <w:pStyle w:val="BodyText"/>
       </w:pPr>
       <w:r>
-        <w:t>Chapter 11, Keta Pilot Implementation, describes in operational detail what the MRV system looks like in practice at Ghana’s principal blue carbon site — the 57-station monitoring network, the PSP locations including Salo, the early action hub at Dzita, the CREMA formation status, and the specific landscape risks from Akosombo Dam sediment starvation and fuelwood pressure that make Keta both the most important monitoring priority and the most demanding stress test for the MRV design.</w:t>
-      </w:r>
-    </w:p>
-    <w:p>
-      <w:pPr>
-        <w:pStyle w:val="BodyText"/>
-      </w:pPr>
+        <w:t xml:space="preserve">Chapter 11, Keta Pilot Implementation, describes in operational detail what the MRV system looks like in practice at Ghana’s principal blue carbon site — the 57-station monitoring network, the PSP locations including Salo, the early action hub at Dzita, the CREMA formation status, and the specific landscape risks from Akosombo Dam </w:t>
+      </w:r>
       <w:r>
         <w:lastRenderedPageBreak/>
+        <w:t>sediment starvation and fuelwood pressure that make Keta both the most important monitoring priority and the most demanding stress test for the MRV design.</w:t>
+      </w:r>
+    </w:p>
+    <w:p>
+      <w:pPr>
+        <w:pStyle w:val="BodyText"/>
+      </w:pPr>
+      <w:r>
         <w:t>Chapter 12, Implementation Maturity Assessment, provides an honest, evidence-grounded account of where the MRV system currently stands — what has been built, what is partially operational, what remains to be resourced and commissioned — and what institutional and financial conditions must be met to move from a well-designed framework to a fully functioning national monitoring system. The chapter distinguishes between the completeness of the MRV framework design and the progress of MRV system operationalisation, giving MESTI and MLNR a clear map of the investments required to cross that threshold.</w:t>
       </w:r>
     </w:p>
@@ -7060,11 +7081,11 @@
         <w:pStyle w:val="BodyText"/>
       </w:pPr>
       <w:r>
-        <w:t xml:space="preserve">It was this recognition — shared across the sub-region — that motivated the design of the West Africa Coastal Areas Resilience Investment Project (WACA ResIP 2). Approved by the World Bank in December 2022 under project number P175625, WACA ResIP 2 is a regional platform operating across three beneficiary countries: Ghana, the Gambia, and Guinea-Bissau. It was built on the premise that the scale of coastal degradation in West Africa exceeds what any single government or development partner can finance or effectively address in isolation, and that a regional framework combining national investments with shared knowledge and coordinated reporting offers </w:t>
+        <w:t xml:space="preserve">It was this recognition — shared across the sub-region — that motivated the design of the West Africa Coastal Areas Resilience Investment Project (WACA ResIP 2). Approved by the World Bank in December 2022 under project number P175625, WACA ResIP 2 is a regional platform operating across three beneficiary countries: Ghana, the Gambia, and Guinea-Bissau. It was built on the premise that the scale of coastal degradation in West Africa exceeds what any single government or development partner can finance or effectively address in isolation, and that a regional framework </w:t>
       </w:r>
       <w:r>
         <w:lastRenderedPageBreak/>
-        <w:t>a materially more durable response than country-by-country projects operating independently.</w:t>
+        <w:t>combining national investments with shared knowledge and coordinated reporting offers a materially more durable response than country-by-country projects operating independently.</w:t>
       </w:r>
     </w:p>
     <w:p>

</xml_diff>